<commit_message>
Modify to auro get local tool folder
</commit_message>
<xml_diff>
--- a/documents/versions_of_tool/core_and_pro_framework.docx
+++ b/documents/versions_of_tool/core_and_pro_framework.docx
@@ -1012,6 +1012,19 @@
         <w:rPr>
           <w:rFonts w:ascii="Liberation Sans" w:hAnsi="Liberation Sans"/>
         </w:rPr>
+      </w:r>
+    </w:p>
+    <w:p>
+      <w:pPr>
+        <w:pStyle w:val="BodyText"/>
+        <w:rPr>
+          <w:rFonts w:ascii="Liberation Sans" w:hAnsi="Liberation Sans"/>
+        </w:rPr>
+      </w:pPr>
+      <w:r>
+        <w:rPr>
+          <w:rFonts w:ascii="Liberation Sans" w:hAnsi="Liberation Sans"/>
+        </w:rPr>
         <w:t>For</w:t>
       </w:r>
       <w:r>
@@ -1490,7 +1503,11 @@
         </w:rPr>
       </w:pPr>
       <w:r>
-        <w:rPr/>
+        <w:rPr>
+          <w:rFonts w:eastAsia="NSimSun" w:cs="Lucida Sans" w:ascii="Liberation Sans" w:hAnsi="Liberation Sans"/>
+          <w:sz w:val="24"/>
+          <w:szCs w:val="24"/>
+        </w:rPr>
       </w:r>
     </w:p>
     <w:p>
@@ -2898,7 +2915,7 @@
     <w:pPr>
       <w:widowControl/>
       <w:suppressAutoHyphens w:val="true"/>
-      <w:overflowPunct w:val="true"/>
+      <w:overflowPunct w:val="false"/>
       <w:bidi w:val="0"/>
       <w:spacing w:before="0" w:after="0"/>
       <w:jc w:val="start"/>

</xml_diff>